<commit_message>
Add ACM Interim Layout version of the journal article; fix truncated Chavan & Mitra title
The journal article is now also available in the ACM Interim Layout template
(two-column, ACM numeric references, CCS concepts) as uploaded by the author.
The Chavan & Mitra (2022) reference title was truncated to 'Tcherly:' because
Crossref stores the subtitle separately; the full title is restored in the
thesis, both article versions and the CSL-JSON library.
</commit_message>
<xml_diff>
--- a/journal_article/Journal_Article_Elsevier.docx
+++ b/journal_article/Journal_Article_Elsevier.docx
@@ -1916,7 +1916,7 @@
             <w:sz w:val="24"/>
             <w:szCs w:val="24"/>
           </w:rPr>
-          <w:tag w:val="MENDELEY_CITATION_v3_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"/>
+          <w:tag w:val="MENDELEY_CITATION_v3_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"/>
           <w:id w:val="474769609"/>
         </w:sdtPr>
         <w:sdtContent>
@@ -13751,7 +13751,7 @@
               <w:sz w:val="24"/>
               <w:szCs w:val="24"/>
             </w:rPr>
-            <w:t xml:space="preserve">Chavan, P., &amp; Mitra, R. (2022). Tcherly: </w:t>
+            <w:t xml:space="preserve">Chavan, P., &amp; Mitra, R. (2022). Tcherly: A teacher-facing dashboard for online video lectures. </w:t>
           </w:r>
           <w:r>
             <w:rPr>

</xml_diff>